<commit_message>
Agrega 4 procedimientos faltantes y enlaza políticas↔procedimientos en ambos sentidos
- Nuevos procedimientos (.docx, formato del set): PROC-SGSI-15 Desarrollo seguro
  (SDLC, cierra G-13), 16 Respuesta ante malware (POL-04), 17 Uso seguro de
  dispositivos (POL-06), 18 Cifrado y gestión de llaves (POL-12).
- Hipervínculos clicables en ambos sentidos: cada política enlaza su(s)
  procedimiento(s) y cada procedimiento su política base (Ctrl+clic en Word/LO).
  Las 15 políticas quedan con procedimiento dedicado (POL-04/06/12 → 16/17/18;
  PROC-15 SDLC referenciado desde POL-09 y POL-15).
- Índices: Maestro (54 docs, 18 procedimientos), mapeo ISO, READMEs,
  Gap Analysis (G-13/G-14 resueltos) y RACI (proceso 20 SDLC → PROC-15).

Co-Authored-By: Claude Opus 4.8 (1M context) <noreply@anthropic.com>
</commit_message>
<xml_diff>
--- a/01-politicas/POL-SGSI-04 - Política de protección contra malware.docx
+++ b/01-politicas/POL-SGSI-04 - Política de protección contra malware.docx
@@ -2390,6 +2390,23 @@
         </w:rPr>
         <w:t>7. Documentos relacionados</w:t>
       </w:r>
+    </w:p>
+    <w:p>
+      <w:r>
+        <w:rPr>
+          <w:b/>
+        </w:rPr>
+        <w:t xml:space="preserve">Procedimiento(s) vinculado(s): </w:t>
+      </w:r>
+      <w:hyperlink r:id="rIdLnkB1" w:history="1">
+        <w:r>
+          <w:rPr>
+            <w:color w:val="0563C1"/>
+            <w:u w:val="single"/>
+          </w:rPr>
+          <w:t xml:space="preserve">PROC-SGSI-16 — Procedimiento de respuesta ante malware</w:t>
+        </w:r>
+      </w:hyperlink>
     </w:p>
     <w:p>
       <w:pPr>

</xml_diff>